<commit_message>
Agregamos cambios en el informe
</commit_message>
<xml_diff>
--- a/Informe_TPI_CambioAtlantico.docx
+++ b/Informe_TPI_CambioAtlantico.docx
@@ -71,8 +71,21 @@
         <w:jc w:val="center"/>
       </w:pPr>
       <w:r>
-        <w:t>Integrantes: [ Nombre y Apellido 1 ] — [ Nombre y Apellido 2 ]</w:t>
-      </w:r>
+        <w:t xml:space="preserve">Integrantes: [ Nombre y Apellido </w:t>
+      </w:r>
+      <w:proofErr w:type="gramStart"/>
+      <w:r>
+        <w:t>1 ]</w:t>
+      </w:r>
+      <w:proofErr w:type="gramEnd"/>
+      <w:r>
+        <w:t xml:space="preserve"> — [ Nombre y Apellido </w:t>
+      </w:r>
+      <w:proofErr w:type="gramStart"/>
+      <w:r>
+        <w:t>2 ]</w:t>
+      </w:r>
+      <w:proofErr w:type="gramEnd"/>
     </w:p>
     <w:p>
       <w:pPr>
@@ -88,8 +101,13 @@
         <w:jc w:val="center"/>
       </w:pPr>
       <w:r>
-        <w:t>Fecha de entrega: [ completar ]</w:t>
-      </w:r>
+        <w:t xml:space="preserve">Fecha de entrega: [ </w:t>
+      </w:r>
+      <w:proofErr w:type="gramStart"/>
+      <w:r>
+        <w:t>completar ]</w:t>
+      </w:r>
+      <w:proofErr w:type="gramEnd"/>
     </w:p>
     <w:p>
       <w:r>
@@ -480,7 +498,15 @@
         <w:jc w:val="both"/>
       </w:pPr>
       <w:r>
-        <w:t xml:space="preserve">El modelo incluye los elementos requeridos: un evento de inicio, tres eventos de fin diferenciados (consulta informativa, operación sin stock y operación completada) y dos compuertas de decisión. La primera compuerta, ¿Opera o consulta?, permite que el cliente obtenga la cotización sin necesidad de operar. La segunda, ¿Hay disponibilidad?, verifica si existe stock suficiente: cuando el cliente compra divisa, controla el stock de la moneda; cuando vende, controla el saldo de pesos en caja. De este modo, el </w:t>
+        <w:t xml:space="preserve">El modelo incluye los elementos requeridos: un evento de inicio, tres eventos de fin diferenciados (consulta informativa, operación sin stock y operación completada) y dos compuertas de decisión. La primera compuerta, ¿Opera o consulta?, permite que el cliente obtenga la cotización sin necesidad de operar. La segunda, ¿Hay disponibilidad?, verifica si existe stock suficiente: cuando el cliente compra divisa, controla el stock de la moneda; cuando vende, controla el saldo de pesos en </w:t>
+      </w:r>
+      <w:proofErr w:type="gramStart"/>
+      <w:r>
+        <w:t>caja</w:t>
+      </w:r>
+      <w:proofErr w:type="gramEnd"/>
+      <w:r>
+        <w:t xml:space="preserve">. De este modo, el </w:t>
       </w:r>
       <w:proofErr w:type="spellStart"/>
       <w:r>
@@ -662,6 +688,9 @@
         <w:jc w:val="center"/>
       </w:pPr>
       <w:r>
+        <w:rPr>
+          <w:noProof/>
+        </w:rPr>
         <w:drawing>
           <wp:inline distT="0" distB="0" distL="0" distR="0" wp14:anchorId="772DC9C5" wp14:editId="35559538">
             <wp:extent cx="5731510" cy="4525010"/>
@@ -856,12 +885,6 @@
         <w:gridCol w:w="1709"/>
       </w:tblGrid>
       <w:tr>
-        <w:tblPrEx>
-          <w:tblCellMar>
-            <w:top w:w="0" w:type="dxa"/>
-            <w:bottom w:w="0" w:type="dxa"/>
-          </w:tblCellMar>
-        </w:tblPrEx>
         <w:trPr>
           <w:tblHeader/>
         </w:trPr>
@@ -987,12 +1010,6 @@
         </w:tc>
       </w:tr>
       <w:tr>
-        <w:tblPrEx>
-          <w:tblCellMar>
-            <w:top w:w="0" w:type="dxa"/>
-            <w:bottom w:w="0" w:type="dxa"/>
-          </w:tblCellMar>
-        </w:tblPrEx>
         <w:tc>
           <w:tcPr>
             <w:tcW w:w="2400" w:type="dxa"/>
@@ -1102,12 +1119,6 @@
         </w:tc>
       </w:tr>
       <w:tr>
-        <w:tblPrEx>
-          <w:tblCellMar>
-            <w:top w:w="0" w:type="dxa"/>
-            <w:bottom w:w="0" w:type="dxa"/>
-          </w:tblCellMar>
-        </w:tblPrEx>
         <w:tc>
           <w:tcPr>
             <w:tcW w:w="2400" w:type="dxa"/>
@@ -1222,12 +1233,6 @@
         </w:tc>
       </w:tr>
       <w:tr>
-        <w:tblPrEx>
-          <w:tblCellMar>
-            <w:top w:w="0" w:type="dxa"/>
-            <w:bottom w:w="0" w:type="dxa"/>
-          </w:tblCellMar>
-        </w:tblPrEx>
         <w:tc>
           <w:tcPr>
             <w:tcW w:w="2400" w:type="dxa"/>
@@ -1342,12 +1347,6 @@
         </w:tc>
       </w:tr>
       <w:tr>
-        <w:tblPrEx>
-          <w:tblCellMar>
-            <w:top w:w="0" w:type="dxa"/>
-            <w:bottom w:w="0" w:type="dxa"/>
-          </w:tblCellMar>
-        </w:tblPrEx>
         <w:tc>
           <w:tcPr>
             <w:tcW w:w="2400" w:type="dxa"/>
@@ -1462,12 +1461,6 @@
         </w:tc>
       </w:tr>
       <w:tr>
-        <w:tblPrEx>
-          <w:tblCellMar>
-            <w:top w:w="0" w:type="dxa"/>
-            <w:bottom w:w="0" w:type="dxa"/>
-          </w:tblCellMar>
-        </w:tblPrEx>
         <w:tc>
           <w:tcPr>
             <w:tcW w:w="2400" w:type="dxa"/>
@@ -1582,12 +1575,6 @@
         </w:tc>
       </w:tr>
       <w:tr>
-        <w:tblPrEx>
-          <w:tblCellMar>
-            <w:top w:w="0" w:type="dxa"/>
-            <w:bottom w:w="0" w:type="dxa"/>
-          </w:tblCellMar>
-        </w:tblPrEx>
         <w:tc>
           <w:tcPr>
             <w:tcW w:w="2400" w:type="dxa"/>
@@ -1702,12 +1689,6 @@
         </w:tc>
       </w:tr>
       <w:tr>
-        <w:tblPrEx>
-          <w:tblCellMar>
-            <w:top w:w="0" w:type="dxa"/>
-            <w:bottom w:w="0" w:type="dxa"/>
-          </w:tblCellMar>
-        </w:tblPrEx>
         <w:tc>
           <w:tcPr>
             <w:tcW w:w="2400" w:type="dxa"/>
@@ -1822,12 +1803,6 @@
         </w:tc>
       </w:tr>
       <w:tr>
-        <w:tblPrEx>
-          <w:tblCellMar>
-            <w:top w:w="0" w:type="dxa"/>
-            <w:bottom w:w="0" w:type="dxa"/>
-          </w:tblCellMar>
-        </w:tblPrEx>
         <w:tc>
           <w:tcPr>
             <w:tcW w:w="2400" w:type="dxa"/>
@@ -1945,14 +1920,25 @@
     <w:p>
       <w:pPr>
         <w:spacing w:before="240" w:after="120"/>
-      </w:pPr>
-      <w:r>
         <w:rPr>
           <w:b/>
           <w:bCs/>
           <w:sz w:val="24"/>
           <w:szCs w:val="24"/>
         </w:rPr>
+      </w:pPr>
+    </w:p>
+    <w:p>
+      <w:pPr>
+        <w:spacing w:before="240" w:after="120"/>
+      </w:pPr>
+      <w:r>
+        <w:rPr>
+          <w:b/>
+          <w:bCs/>
+          <w:sz w:val="24"/>
+          <w:szCs w:val="24"/>
+        </w:rPr>
         <w:t>6. DICCIONARIO DE DATOS Y PERSISTENCIA</w:t>
       </w:r>
     </w:p>
@@ -1971,1542 +1957,168 @@
         <w:t xml:space="preserve"> se describen los campos principales:</w:t>
       </w:r>
     </w:p>
-    <w:tbl>
-      <w:tblPr>
-        <w:tblW w:w="9026" w:type="dxa"/>
-        <w:tblBorders>
-          <w:top w:val="single" w:sz="4" w:space="0" w:color="auto"/>
-          <w:left w:val="single" w:sz="4" w:space="0" w:color="auto"/>
-          <w:bottom w:val="single" w:sz="4" w:space="0" w:color="auto"/>
-          <w:right w:val="single" w:sz="4" w:space="0" w:color="auto"/>
-          <w:insideH w:val="single" w:sz="4" w:space="0" w:color="auto"/>
-          <w:insideV w:val="single" w:sz="4" w:space="0" w:color="auto"/>
-        </w:tblBorders>
-        <w:tblCellMar>
-          <w:left w:w="10" w:type="dxa"/>
-          <w:right w:w="10" w:type="dxa"/>
-        </w:tblCellMar>
-        <w:tblLook w:val="04A0" w:firstRow="1" w:lastRow="0" w:firstColumn="1" w:lastColumn="0" w:noHBand="0" w:noVBand="1"/>
-      </w:tblPr>
-      <w:tblGrid>
-        <w:gridCol w:w="1500"/>
-        <w:gridCol w:w="1700"/>
-        <w:gridCol w:w="1100"/>
-        <w:gridCol w:w="3026"/>
-        <w:gridCol w:w="1700"/>
-      </w:tblGrid>
-      <w:tr>
-        <w:tblPrEx>
-          <w:tblCellMar>
-            <w:top w:w="0" w:type="dxa"/>
-            <w:bottom w:w="0" w:type="dxa"/>
-          </w:tblCellMar>
-        </w:tblPrEx>
-        <w:trPr>
-          <w:tblHeader/>
-        </w:trPr>
-        <w:tc>
-          <w:tcPr>
-            <w:tcW w:w="1500" w:type="dxa"/>
-            <w:tcBorders>
-              <w:top w:val="single" w:sz="1" w:space="0" w:color="BFBFBF"/>
-              <w:left w:val="single" w:sz="1" w:space="0" w:color="BFBFBF"/>
-              <w:bottom w:val="single" w:sz="1" w:space="0" w:color="BFBFBF"/>
-              <w:right w:val="single" w:sz="1" w:space="0" w:color="BFBFBF"/>
-            </w:tcBorders>
-            <w:shd w:val="clear" w:color="auto" w:fill="1F4E79"/>
-            <w:tcMar>
-              <w:top w:w="60" w:type="dxa"/>
-              <w:left w:w="110" w:type="dxa"/>
-              <w:bottom w:w="60" w:type="dxa"/>
-              <w:right w:w="110" w:type="dxa"/>
-            </w:tcMar>
-          </w:tcPr>
-          <w:p>
-            <w:r>
-              <w:rPr>
-                <w:b/>
-                <w:bCs/>
-                <w:color w:val="FFFFFF"/>
-                <w:sz w:val="20"/>
-                <w:szCs w:val="20"/>
-              </w:rPr>
-              <w:t>Entidad</w:t>
-            </w:r>
-          </w:p>
-        </w:tc>
-        <w:tc>
-          <w:tcPr>
-            <w:tcW w:w="1700" w:type="dxa"/>
-            <w:tcBorders>
-              <w:top w:val="single" w:sz="1" w:space="0" w:color="BFBFBF"/>
-              <w:left w:val="single" w:sz="1" w:space="0" w:color="BFBFBF"/>
-              <w:bottom w:val="single" w:sz="1" w:space="0" w:color="BFBFBF"/>
-              <w:right w:val="single" w:sz="1" w:space="0" w:color="BFBFBF"/>
-            </w:tcBorders>
-            <w:shd w:val="clear" w:color="auto" w:fill="1F4E79"/>
-            <w:tcMar>
-              <w:top w:w="60" w:type="dxa"/>
-              <w:left w:w="110" w:type="dxa"/>
-              <w:bottom w:w="60" w:type="dxa"/>
-              <w:right w:w="110" w:type="dxa"/>
-            </w:tcMar>
-          </w:tcPr>
-          <w:p>
-            <w:r>
-              <w:rPr>
-                <w:b/>
-                <w:bCs/>
-                <w:color w:val="FFFFFF"/>
-                <w:sz w:val="20"/>
-                <w:szCs w:val="20"/>
-              </w:rPr>
-              <w:t>Campo</w:t>
-            </w:r>
-          </w:p>
-        </w:tc>
-        <w:tc>
-          <w:tcPr>
-            <w:tcW w:w="1100" w:type="dxa"/>
-            <w:tcBorders>
-              <w:top w:val="single" w:sz="1" w:space="0" w:color="BFBFBF"/>
-              <w:left w:val="single" w:sz="1" w:space="0" w:color="BFBFBF"/>
-              <w:bottom w:val="single" w:sz="1" w:space="0" w:color="BFBFBF"/>
-              <w:right w:val="single" w:sz="1" w:space="0" w:color="BFBFBF"/>
-            </w:tcBorders>
-            <w:shd w:val="clear" w:color="auto" w:fill="1F4E79"/>
-            <w:tcMar>
-              <w:top w:w="60" w:type="dxa"/>
-              <w:left w:w="110" w:type="dxa"/>
-              <w:bottom w:w="60" w:type="dxa"/>
-              <w:right w:w="110" w:type="dxa"/>
-            </w:tcMar>
-          </w:tcPr>
-          <w:p>
-            <w:r>
-              <w:rPr>
-                <w:b/>
-                <w:bCs/>
-                <w:color w:val="FFFFFF"/>
-                <w:sz w:val="20"/>
-                <w:szCs w:val="20"/>
-              </w:rPr>
-              <w:t>Tipo</w:t>
-            </w:r>
-          </w:p>
-        </w:tc>
-        <w:tc>
-          <w:tcPr>
-            <w:tcW w:w="3026" w:type="dxa"/>
-            <w:tcBorders>
-              <w:top w:val="single" w:sz="1" w:space="0" w:color="BFBFBF"/>
-              <w:left w:val="single" w:sz="1" w:space="0" w:color="BFBFBF"/>
-              <w:bottom w:val="single" w:sz="1" w:space="0" w:color="BFBFBF"/>
-              <w:right w:val="single" w:sz="1" w:space="0" w:color="BFBFBF"/>
-            </w:tcBorders>
-            <w:shd w:val="clear" w:color="auto" w:fill="1F4E79"/>
-            <w:tcMar>
-              <w:top w:w="60" w:type="dxa"/>
-              <w:left w:w="110" w:type="dxa"/>
-              <w:bottom w:w="60" w:type="dxa"/>
-              <w:right w:w="110" w:type="dxa"/>
-            </w:tcMar>
-          </w:tcPr>
-          <w:p>
-            <w:r>
-              <w:rPr>
-                <w:b/>
-                <w:bCs/>
-                <w:color w:val="FFFFFF"/>
-                <w:sz w:val="20"/>
-                <w:szCs w:val="20"/>
-              </w:rPr>
-              <w:t>Descripción</w:t>
-            </w:r>
-          </w:p>
-        </w:tc>
-        <w:tc>
-          <w:tcPr>
-            <w:tcW w:w="1700" w:type="dxa"/>
-            <w:tcBorders>
-              <w:top w:val="single" w:sz="1" w:space="0" w:color="BFBFBF"/>
-              <w:left w:val="single" w:sz="1" w:space="0" w:color="BFBFBF"/>
-              <w:bottom w:val="single" w:sz="1" w:space="0" w:color="BFBFBF"/>
-              <w:right w:val="single" w:sz="1" w:space="0" w:color="BFBFBF"/>
-            </w:tcBorders>
-            <w:shd w:val="clear" w:color="auto" w:fill="1F4E79"/>
-            <w:tcMar>
-              <w:top w:w="60" w:type="dxa"/>
-              <w:left w:w="110" w:type="dxa"/>
-              <w:bottom w:w="60" w:type="dxa"/>
-              <w:right w:w="110" w:type="dxa"/>
-            </w:tcMar>
-          </w:tcPr>
-          <w:p>
-            <w:r>
-              <w:rPr>
-                <w:b/>
-                <w:bCs/>
-                <w:color w:val="FFFFFF"/>
-                <w:sz w:val="20"/>
-                <w:szCs w:val="20"/>
-              </w:rPr>
-              <w:t>Validación</w:t>
-            </w:r>
-          </w:p>
-        </w:tc>
-      </w:tr>
-      <w:tr>
-        <w:tblPrEx>
-          <w:tblCellMar>
-            <w:top w:w="0" w:type="dxa"/>
-            <w:bottom w:w="0" w:type="dxa"/>
-          </w:tblCellMar>
-        </w:tblPrEx>
-        <w:tc>
-          <w:tcPr>
-            <w:tcW w:w="1500" w:type="dxa"/>
-            <w:tcBorders>
-              <w:top w:val="single" w:sz="1" w:space="0" w:color="BFBFBF"/>
-              <w:left w:val="single" w:sz="1" w:space="0" w:color="BFBFBF"/>
-              <w:bottom w:val="single" w:sz="1" w:space="0" w:color="BFBFBF"/>
-              <w:right w:val="single" w:sz="1" w:space="0" w:color="BFBFBF"/>
-            </w:tcBorders>
-            <w:shd w:val="clear" w:color="auto" w:fill="FFFFFF"/>
-            <w:tcMar>
-              <w:top w:w="60" w:type="dxa"/>
-              <w:left w:w="110" w:type="dxa"/>
-              <w:bottom w:w="60" w:type="dxa"/>
-              <w:right w:w="110" w:type="dxa"/>
-            </w:tcMar>
-          </w:tcPr>
-          <w:p>
-            <w:r>
-              <w:rPr>
-                <w:color w:val="000000"/>
-                <w:sz w:val="20"/>
-                <w:szCs w:val="20"/>
-              </w:rPr>
-              <w:t>Cotizaciones</w:t>
-            </w:r>
-          </w:p>
-        </w:tc>
-        <w:tc>
-          <w:tcPr>
-            <w:tcW w:w="1700" w:type="dxa"/>
-            <w:tcBorders>
-              <w:top w:val="single" w:sz="1" w:space="0" w:color="BFBFBF"/>
-              <w:left w:val="single" w:sz="1" w:space="0" w:color="BFBFBF"/>
-              <w:bottom w:val="single" w:sz="1" w:space="0" w:color="BFBFBF"/>
-              <w:right w:val="single" w:sz="1" w:space="0" w:color="BFBFBF"/>
-            </w:tcBorders>
-            <w:shd w:val="clear" w:color="auto" w:fill="FFFFFF"/>
-            <w:tcMar>
-              <w:top w:w="60" w:type="dxa"/>
-              <w:left w:w="110" w:type="dxa"/>
-              <w:bottom w:w="60" w:type="dxa"/>
-              <w:right w:w="110" w:type="dxa"/>
-            </w:tcMar>
-          </w:tcPr>
-          <w:p>
-            <w:r>
-              <w:rPr>
-                <w:color w:val="000000"/>
-                <w:sz w:val="20"/>
-                <w:szCs w:val="20"/>
-              </w:rPr>
-              <w:t>moneda</w:t>
-            </w:r>
-          </w:p>
-        </w:tc>
-        <w:tc>
-          <w:tcPr>
-            <w:tcW w:w="1100" w:type="dxa"/>
-            <w:tcBorders>
-              <w:top w:val="single" w:sz="1" w:space="0" w:color="BFBFBF"/>
-              <w:left w:val="single" w:sz="1" w:space="0" w:color="BFBFBF"/>
-              <w:bottom w:val="single" w:sz="1" w:space="0" w:color="BFBFBF"/>
-              <w:right w:val="single" w:sz="1" w:space="0" w:color="BFBFBF"/>
-            </w:tcBorders>
-            <w:shd w:val="clear" w:color="auto" w:fill="FFFFFF"/>
-            <w:tcMar>
-              <w:top w:w="60" w:type="dxa"/>
-              <w:left w:w="110" w:type="dxa"/>
-              <w:bottom w:w="60" w:type="dxa"/>
-              <w:right w:w="110" w:type="dxa"/>
-            </w:tcMar>
-          </w:tcPr>
-          <w:p>
-            <w:r>
-              <w:rPr>
-                <w:color w:val="000000"/>
-                <w:sz w:val="20"/>
-                <w:szCs w:val="20"/>
-              </w:rPr>
-              <w:t>texto</w:t>
-            </w:r>
-          </w:p>
-        </w:tc>
-        <w:tc>
-          <w:tcPr>
-            <w:tcW w:w="3026" w:type="dxa"/>
-            <w:tcBorders>
-              <w:top w:val="single" w:sz="1" w:space="0" w:color="BFBFBF"/>
-              <w:left w:val="single" w:sz="1" w:space="0" w:color="BFBFBF"/>
-              <w:bottom w:val="single" w:sz="1" w:space="0" w:color="BFBFBF"/>
-              <w:right w:val="single" w:sz="1" w:space="0" w:color="BFBFBF"/>
-            </w:tcBorders>
-            <w:shd w:val="clear" w:color="auto" w:fill="FFFFFF"/>
-            <w:tcMar>
-              <w:top w:w="60" w:type="dxa"/>
-              <w:left w:w="110" w:type="dxa"/>
-              <w:bottom w:w="60" w:type="dxa"/>
-              <w:right w:w="110" w:type="dxa"/>
-            </w:tcMar>
-          </w:tcPr>
-          <w:p>
-            <w:r>
-              <w:rPr>
-                <w:color w:val="000000"/>
-                <w:sz w:val="20"/>
-                <w:szCs w:val="20"/>
-              </w:rPr>
-              <w:t>Código de la divisa</w:t>
-            </w:r>
-          </w:p>
-        </w:tc>
-        <w:tc>
-          <w:tcPr>
-            <w:tcW w:w="1700" w:type="dxa"/>
-            <w:tcBorders>
-              <w:top w:val="single" w:sz="1" w:space="0" w:color="BFBFBF"/>
-              <w:left w:val="single" w:sz="1" w:space="0" w:color="BFBFBF"/>
-              <w:bottom w:val="single" w:sz="1" w:space="0" w:color="BFBFBF"/>
-              <w:right w:val="single" w:sz="1" w:space="0" w:color="BFBFBF"/>
-            </w:tcBorders>
-            <w:shd w:val="clear" w:color="auto" w:fill="FFFFFF"/>
-            <w:tcMar>
-              <w:top w:w="60" w:type="dxa"/>
-              <w:left w:w="110" w:type="dxa"/>
-              <w:bottom w:w="60" w:type="dxa"/>
-              <w:right w:w="110" w:type="dxa"/>
-            </w:tcMar>
-          </w:tcPr>
-          <w:p>
-            <w:r>
-              <w:rPr>
-                <w:color w:val="000000"/>
-                <w:sz w:val="20"/>
-                <w:szCs w:val="20"/>
-              </w:rPr>
-              <w:t>USD o EUR</w:t>
-            </w:r>
-          </w:p>
-        </w:tc>
-      </w:tr>
-      <w:tr>
-        <w:tblPrEx>
-          <w:tblCellMar>
-            <w:top w:w="0" w:type="dxa"/>
-            <w:bottom w:w="0" w:type="dxa"/>
-          </w:tblCellMar>
-        </w:tblPrEx>
-        <w:tc>
-          <w:tcPr>
-            <w:tcW w:w="1500" w:type="dxa"/>
-            <w:tcBorders>
-              <w:top w:val="single" w:sz="1" w:space="0" w:color="BFBFBF"/>
-              <w:left w:val="single" w:sz="1" w:space="0" w:color="BFBFBF"/>
-              <w:bottom w:val="single" w:sz="1" w:space="0" w:color="BFBFBF"/>
-              <w:right w:val="single" w:sz="1" w:space="0" w:color="BFBFBF"/>
-            </w:tcBorders>
-            <w:shd w:val="clear" w:color="auto" w:fill="FFFFFF"/>
-            <w:tcMar>
-              <w:top w:w="60" w:type="dxa"/>
-              <w:left w:w="110" w:type="dxa"/>
-              <w:bottom w:w="60" w:type="dxa"/>
-              <w:right w:w="110" w:type="dxa"/>
-            </w:tcMar>
-          </w:tcPr>
-          <w:p>
-            <w:r>
-              <w:rPr>
-                <w:color w:val="000000"/>
-                <w:sz w:val="20"/>
-                <w:szCs w:val="20"/>
-              </w:rPr>
-              <w:t>Cotizaciones</w:t>
-            </w:r>
-          </w:p>
-        </w:tc>
-        <w:tc>
-          <w:tcPr>
-            <w:tcW w:w="1700" w:type="dxa"/>
-            <w:tcBorders>
-              <w:top w:val="single" w:sz="1" w:space="0" w:color="BFBFBF"/>
-              <w:left w:val="single" w:sz="1" w:space="0" w:color="BFBFBF"/>
-              <w:bottom w:val="single" w:sz="1" w:space="0" w:color="BFBFBF"/>
-              <w:right w:val="single" w:sz="1" w:space="0" w:color="BFBFBF"/>
-            </w:tcBorders>
-            <w:shd w:val="clear" w:color="auto" w:fill="FFFFFF"/>
-            <w:tcMar>
-              <w:top w:w="60" w:type="dxa"/>
-              <w:left w:w="110" w:type="dxa"/>
-              <w:bottom w:w="60" w:type="dxa"/>
-              <w:right w:w="110" w:type="dxa"/>
-            </w:tcMar>
-          </w:tcPr>
-          <w:p>
-            <w:proofErr w:type="spellStart"/>
-            <w:r>
-              <w:rPr>
-                <w:color w:val="000000"/>
-                <w:sz w:val="20"/>
-                <w:szCs w:val="20"/>
-              </w:rPr>
-              <w:t>compra_ars</w:t>
-            </w:r>
-            <w:proofErr w:type="spellEnd"/>
-          </w:p>
-        </w:tc>
-        <w:tc>
-          <w:tcPr>
-            <w:tcW w:w="1100" w:type="dxa"/>
-            <w:tcBorders>
-              <w:top w:val="single" w:sz="1" w:space="0" w:color="BFBFBF"/>
-              <w:left w:val="single" w:sz="1" w:space="0" w:color="BFBFBF"/>
-              <w:bottom w:val="single" w:sz="1" w:space="0" w:color="BFBFBF"/>
-              <w:right w:val="single" w:sz="1" w:space="0" w:color="BFBFBF"/>
-            </w:tcBorders>
-            <w:shd w:val="clear" w:color="auto" w:fill="FFFFFF"/>
-            <w:tcMar>
-              <w:top w:w="60" w:type="dxa"/>
-              <w:left w:w="110" w:type="dxa"/>
-              <w:bottom w:w="60" w:type="dxa"/>
-              <w:right w:w="110" w:type="dxa"/>
-            </w:tcMar>
-          </w:tcPr>
-          <w:p>
-            <w:r>
-              <w:rPr>
-                <w:color w:val="000000"/>
-                <w:sz w:val="20"/>
-                <w:szCs w:val="20"/>
-              </w:rPr>
-              <w:t>número</w:t>
-            </w:r>
-          </w:p>
-        </w:tc>
-        <w:tc>
-          <w:tcPr>
-            <w:tcW w:w="3026" w:type="dxa"/>
-            <w:tcBorders>
-              <w:top w:val="single" w:sz="1" w:space="0" w:color="BFBFBF"/>
-              <w:left w:val="single" w:sz="1" w:space="0" w:color="BFBFBF"/>
-              <w:bottom w:val="single" w:sz="1" w:space="0" w:color="BFBFBF"/>
-              <w:right w:val="single" w:sz="1" w:space="0" w:color="BFBFBF"/>
-            </w:tcBorders>
-            <w:shd w:val="clear" w:color="auto" w:fill="FFFFFF"/>
-            <w:tcMar>
-              <w:top w:w="60" w:type="dxa"/>
-              <w:left w:w="110" w:type="dxa"/>
-              <w:bottom w:w="60" w:type="dxa"/>
-              <w:right w:w="110" w:type="dxa"/>
-            </w:tcMar>
-          </w:tcPr>
-          <w:p>
-            <w:r>
-              <w:rPr>
-                <w:color w:val="000000"/>
-                <w:sz w:val="20"/>
-                <w:szCs w:val="20"/>
-              </w:rPr>
-              <w:t>Pesos que paga la casa al comprar la divisa</w:t>
-            </w:r>
-          </w:p>
-        </w:tc>
-        <w:tc>
-          <w:tcPr>
-            <w:tcW w:w="1700" w:type="dxa"/>
-            <w:tcBorders>
-              <w:top w:val="single" w:sz="1" w:space="0" w:color="BFBFBF"/>
-              <w:left w:val="single" w:sz="1" w:space="0" w:color="BFBFBF"/>
-              <w:bottom w:val="single" w:sz="1" w:space="0" w:color="BFBFBF"/>
-              <w:right w:val="single" w:sz="1" w:space="0" w:color="BFBFBF"/>
-            </w:tcBorders>
-            <w:shd w:val="clear" w:color="auto" w:fill="FFFFFF"/>
-            <w:tcMar>
-              <w:top w:w="60" w:type="dxa"/>
-              <w:left w:w="110" w:type="dxa"/>
-              <w:bottom w:w="60" w:type="dxa"/>
-              <w:right w:w="110" w:type="dxa"/>
-            </w:tcMar>
-          </w:tcPr>
-          <w:p>
-            <w:r>
-              <w:rPr>
-                <w:color w:val="000000"/>
-                <w:sz w:val="20"/>
-                <w:szCs w:val="20"/>
-              </w:rPr>
-              <w:t>&gt; 0</w:t>
-            </w:r>
-          </w:p>
-        </w:tc>
-      </w:tr>
-      <w:tr>
-        <w:tblPrEx>
-          <w:tblCellMar>
-            <w:top w:w="0" w:type="dxa"/>
-            <w:bottom w:w="0" w:type="dxa"/>
-          </w:tblCellMar>
-        </w:tblPrEx>
-        <w:tc>
-          <w:tcPr>
-            <w:tcW w:w="1500" w:type="dxa"/>
-            <w:tcBorders>
-              <w:top w:val="single" w:sz="1" w:space="0" w:color="BFBFBF"/>
-              <w:left w:val="single" w:sz="1" w:space="0" w:color="BFBFBF"/>
-              <w:bottom w:val="single" w:sz="1" w:space="0" w:color="BFBFBF"/>
-              <w:right w:val="single" w:sz="1" w:space="0" w:color="BFBFBF"/>
-            </w:tcBorders>
-            <w:shd w:val="clear" w:color="auto" w:fill="FFFFFF"/>
-            <w:tcMar>
-              <w:top w:w="60" w:type="dxa"/>
-              <w:left w:w="110" w:type="dxa"/>
-              <w:bottom w:w="60" w:type="dxa"/>
-              <w:right w:w="110" w:type="dxa"/>
-            </w:tcMar>
-          </w:tcPr>
-          <w:p>
-            <w:r>
-              <w:rPr>
-                <w:color w:val="000000"/>
-                <w:sz w:val="20"/>
-                <w:szCs w:val="20"/>
-              </w:rPr>
-              <w:t>Cotizaciones</w:t>
-            </w:r>
-          </w:p>
-        </w:tc>
-        <w:tc>
-          <w:tcPr>
-            <w:tcW w:w="1700" w:type="dxa"/>
-            <w:tcBorders>
-              <w:top w:val="single" w:sz="1" w:space="0" w:color="BFBFBF"/>
-              <w:left w:val="single" w:sz="1" w:space="0" w:color="BFBFBF"/>
-              <w:bottom w:val="single" w:sz="1" w:space="0" w:color="BFBFBF"/>
-              <w:right w:val="single" w:sz="1" w:space="0" w:color="BFBFBF"/>
-            </w:tcBorders>
-            <w:shd w:val="clear" w:color="auto" w:fill="FFFFFF"/>
-            <w:tcMar>
-              <w:top w:w="60" w:type="dxa"/>
-              <w:left w:w="110" w:type="dxa"/>
-              <w:bottom w:w="60" w:type="dxa"/>
-              <w:right w:w="110" w:type="dxa"/>
-            </w:tcMar>
-          </w:tcPr>
-          <w:p>
-            <w:proofErr w:type="spellStart"/>
-            <w:r>
-              <w:rPr>
-                <w:color w:val="000000"/>
-                <w:sz w:val="20"/>
-                <w:szCs w:val="20"/>
-              </w:rPr>
-              <w:t>venta_ars</w:t>
-            </w:r>
-            <w:proofErr w:type="spellEnd"/>
-          </w:p>
-        </w:tc>
-        <w:tc>
-          <w:tcPr>
-            <w:tcW w:w="1100" w:type="dxa"/>
-            <w:tcBorders>
-              <w:top w:val="single" w:sz="1" w:space="0" w:color="BFBFBF"/>
-              <w:left w:val="single" w:sz="1" w:space="0" w:color="BFBFBF"/>
-              <w:bottom w:val="single" w:sz="1" w:space="0" w:color="BFBFBF"/>
-              <w:right w:val="single" w:sz="1" w:space="0" w:color="BFBFBF"/>
-            </w:tcBorders>
-            <w:shd w:val="clear" w:color="auto" w:fill="FFFFFF"/>
-            <w:tcMar>
-              <w:top w:w="60" w:type="dxa"/>
-              <w:left w:w="110" w:type="dxa"/>
-              <w:bottom w:w="60" w:type="dxa"/>
-              <w:right w:w="110" w:type="dxa"/>
-            </w:tcMar>
-          </w:tcPr>
-          <w:p>
-            <w:r>
-              <w:rPr>
-                <w:color w:val="000000"/>
-                <w:sz w:val="20"/>
-                <w:szCs w:val="20"/>
-              </w:rPr>
-              <w:t>número</w:t>
-            </w:r>
-          </w:p>
-        </w:tc>
-        <w:tc>
-          <w:tcPr>
-            <w:tcW w:w="3026" w:type="dxa"/>
-            <w:tcBorders>
-              <w:top w:val="single" w:sz="1" w:space="0" w:color="BFBFBF"/>
-              <w:left w:val="single" w:sz="1" w:space="0" w:color="BFBFBF"/>
-              <w:bottom w:val="single" w:sz="1" w:space="0" w:color="BFBFBF"/>
-              <w:right w:val="single" w:sz="1" w:space="0" w:color="BFBFBF"/>
-            </w:tcBorders>
-            <w:shd w:val="clear" w:color="auto" w:fill="FFFFFF"/>
-            <w:tcMar>
-              <w:top w:w="60" w:type="dxa"/>
-              <w:left w:w="110" w:type="dxa"/>
-              <w:bottom w:w="60" w:type="dxa"/>
-              <w:right w:w="110" w:type="dxa"/>
-            </w:tcMar>
-          </w:tcPr>
-          <w:p>
-            <w:r>
-              <w:rPr>
-                <w:color w:val="000000"/>
-                <w:sz w:val="20"/>
-                <w:szCs w:val="20"/>
-              </w:rPr>
-              <w:t>Pesos que cobra la casa al vender la divisa</w:t>
-            </w:r>
-          </w:p>
-        </w:tc>
-        <w:tc>
-          <w:tcPr>
-            <w:tcW w:w="1700" w:type="dxa"/>
-            <w:tcBorders>
-              <w:top w:val="single" w:sz="1" w:space="0" w:color="BFBFBF"/>
-              <w:left w:val="single" w:sz="1" w:space="0" w:color="BFBFBF"/>
-              <w:bottom w:val="single" w:sz="1" w:space="0" w:color="BFBFBF"/>
-              <w:right w:val="single" w:sz="1" w:space="0" w:color="BFBFBF"/>
-            </w:tcBorders>
-            <w:shd w:val="clear" w:color="auto" w:fill="FFFFFF"/>
-            <w:tcMar>
-              <w:top w:w="60" w:type="dxa"/>
-              <w:left w:w="110" w:type="dxa"/>
-              <w:bottom w:w="60" w:type="dxa"/>
-              <w:right w:w="110" w:type="dxa"/>
-            </w:tcMar>
-          </w:tcPr>
-          <w:p>
-            <w:r>
-              <w:rPr>
-                <w:color w:val="000000"/>
-                <w:sz w:val="20"/>
-                <w:szCs w:val="20"/>
-              </w:rPr>
-              <w:t>&gt; 0</w:t>
-            </w:r>
-          </w:p>
-        </w:tc>
-      </w:tr>
-      <w:tr>
-        <w:tblPrEx>
-          <w:tblCellMar>
-            <w:top w:w="0" w:type="dxa"/>
-            <w:bottom w:w="0" w:type="dxa"/>
-          </w:tblCellMar>
-        </w:tblPrEx>
-        <w:tc>
-          <w:tcPr>
-            <w:tcW w:w="1500" w:type="dxa"/>
-            <w:tcBorders>
-              <w:top w:val="single" w:sz="1" w:space="0" w:color="BFBFBF"/>
-              <w:left w:val="single" w:sz="1" w:space="0" w:color="BFBFBF"/>
-              <w:bottom w:val="single" w:sz="1" w:space="0" w:color="BFBFBF"/>
-              <w:right w:val="single" w:sz="1" w:space="0" w:color="BFBFBF"/>
-            </w:tcBorders>
-            <w:shd w:val="clear" w:color="auto" w:fill="FFFFFF"/>
-            <w:tcMar>
-              <w:top w:w="60" w:type="dxa"/>
-              <w:left w:w="110" w:type="dxa"/>
-              <w:bottom w:w="60" w:type="dxa"/>
-              <w:right w:w="110" w:type="dxa"/>
-            </w:tcMar>
-          </w:tcPr>
-          <w:p>
-            <w:r>
-              <w:rPr>
-                <w:color w:val="000000"/>
-                <w:sz w:val="20"/>
-                <w:szCs w:val="20"/>
-              </w:rPr>
-              <w:t>Stock</w:t>
-            </w:r>
-          </w:p>
-        </w:tc>
-        <w:tc>
-          <w:tcPr>
-            <w:tcW w:w="1700" w:type="dxa"/>
-            <w:tcBorders>
-              <w:top w:val="single" w:sz="1" w:space="0" w:color="BFBFBF"/>
-              <w:left w:val="single" w:sz="1" w:space="0" w:color="BFBFBF"/>
-              <w:bottom w:val="single" w:sz="1" w:space="0" w:color="BFBFBF"/>
-              <w:right w:val="single" w:sz="1" w:space="0" w:color="BFBFBF"/>
-            </w:tcBorders>
-            <w:shd w:val="clear" w:color="auto" w:fill="FFFFFF"/>
-            <w:tcMar>
-              <w:top w:w="60" w:type="dxa"/>
-              <w:left w:w="110" w:type="dxa"/>
-              <w:bottom w:w="60" w:type="dxa"/>
-              <w:right w:w="110" w:type="dxa"/>
-            </w:tcMar>
-          </w:tcPr>
-          <w:p>
-            <w:r>
-              <w:rPr>
-                <w:color w:val="000000"/>
-                <w:sz w:val="20"/>
-                <w:szCs w:val="20"/>
-              </w:rPr>
-              <w:t>moneda</w:t>
-            </w:r>
-          </w:p>
-        </w:tc>
-        <w:tc>
-          <w:tcPr>
-            <w:tcW w:w="1100" w:type="dxa"/>
-            <w:tcBorders>
-              <w:top w:val="single" w:sz="1" w:space="0" w:color="BFBFBF"/>
-              <w:left w:val="single" w:sz="1" w:space="0" w:color="BFBFBF"/>
-              <w:bottom w:val="single" w:sz="1" w:space="0" w:color="BFBFBF"/>
-              <w:right w:val="single" w:sz="1" w:space="0" w:color="BFBFBF"/>
-            </w:tcBorders>
-            <w:shd w:val="clear" w:color="auto" w:fill="FFFFFF"/>
-            <w:tcMar>
-              <w:top w:w="60" w:type="dxa"/>
-              <w:left w:w="110" w:type="dxa"/>
-              <w:bottom w:w="60" w:type="dxa"/>
-              <w:right w:w="110" w:type="dxa"/>
-            </w:tcMar>
-          </w:tcPr>
-          <w:p>
-            <w:r>
-              <w:rPr>
-                <w:color w:val="000000"/>
-                <w:sz w:val="20"/>
-                <w:szCs w:val="20"/>
-              </w:rPr>
-              <w:t>texto</w:t>
-            </w:r>
-          </w:p>
-        </w:tc>
-        <w:tc>
-          <w:tcPr>
-            <w:tcW w:w="3026" w:type="dxa"/>
-            <w:tcBorders>
-              <w:top w:val="single" w:sz="1" w:space="0" w:color="BFBFBF"/>
-              <w:left w:val="single" w:sz="1" w:space="0" w:color="BFBFBF"/>
-              <w:bottom w:val="single" w:sz="1" w:space="0" w:color="BFBFBF"/>
-              <w:right w:val="single" w:sz="1" w:space="0" w:color="BFBFBF"/>
-            </w:tcBorders>
-            <w:shd w:val="clear" w:color="auto" w:fill="FFFFFF"/>
-            <w:tcMar>
-              <w:top w:w="60" w:type="dxa"/>
-              <w:left w:w="110" w:type="dxa"/>
-              <w:bottom w:w="60" w:type="dxa"/>
-              <w:right w:w="110" w:type="dxa"/>
-            </w:tcMar>
-          </w:tcPr>
-          <w:p>
-            <w:r>
-              <w:rPr>
-                <w:color w:val="000000"/>
-                <w:sz w:val="20"/>
-                <w:szCs w:val="20"/>
-              </w:rPr>
-              <w:t>Divisa o ARS para la caja de pesos</w:t>
-            </w:r>
-          </w:p>
-        </w:tc>
-        <w:tc>
-          <w:tcPr>
-            <w:tcW w:w="1700" w:type="dxa"/>
-            <w:tcBorders>
-              <w:top w:val="single" w:sz="1" w:space="0" w:color="BFBFBF"/>
-              <w:left w:val="single" w:sz="1" w:space="0" w:color="BFBFBF"/>
-              <w:bottom w:val="single" w:sz="1" w:space="0" w:color="BFBFBF"/>
-              <w:right w:val="single" w:sz="1" w:space="0" w:color="BFBFBF"/>
-            </w:tcBorders>
-            <w:shd w:val="clear" w:color="auto" w:fill="FFFFFF"/>
-            <w:tcMar>
-              <w:top w:w="60" w:type="dxa"/>
-              <w:left w:w="110" w:type="dxa"/>
-              <w:bottom w:w="60" w:type="dxa"/>
-              <w:right w:w="110" w:type="dxa"/>
-            </w:tcMar>
-          </w:tcPr>
-          <w:p>
-            <w:r>
-              <w:rPr>
-                <w:color w:val="000000"/>
-                <w:sz w:val="20"/>
-                <w:szCs w:val="20"/>
-              </w:rPr>
-              <w:t>USD, EUR, ARS</w:t>
-            </w:r>
-          </w:p>
-        </w:tc>
-      </w:tr>
-      <w:tr>
-        <w:tblPrEx>
-          <w:tblCellMar>
-            <w:top w:w="0" w:type="dxa"/>
-            <w:bottom w:w="0" w:type="dxa"/>
-          </w:tblCellMar>
-        </w:tblPrEx>
-        <w:tc>
-          <w:tcPr>
-            <w:tcW w:w="1500" w:type="dxa"/>
-            <w:tcBorders>
-              <w:top w:val="single" w:sz="1" w:space="0" w:color="BFBFBF"/>
-              <w:left w:val="single" w:sz="1" w:space="0" w:color="BFBFBF"/>
-              <w:bottom w:val="single" w:sz="1" w:space="0" w:color="BFBFBF"/>
-              <w:right w:val="single" w:sz="1" w:space="0" w:color="BFBFBF"/>
-            </w:tcBorders>
-            <w:shd w:val="clear" w:color="auto" w:fill="FFFFFF"/>
-            <w:tcMar>
-              <w:top w:w="60" w:type="dxa"/>
-              <w:left w:w="110" w:type="dxa"/>
-              <w:bottom w:w="60" w:type="dxa"/>
-              <w:right w:w="110" w:type="dxa"/>
-            </w:tcMar>
-          </w:tcPr>
-          <w:p>
-            <w:r>
-              <w:rPr>
-                <w:color w:val="000000"/>
-                <w:sz w:val="20"/>
-                <w:szCs w:val="20"/>
-              </w:rPr>
-              <w:t>Stock</w:t>
-            </w:r>
-          </w:p>
-        </w:tc>
-        <w:tc>
-          <w:tcPr>
-            <w:tcW w:w="1700" w:type="dxa"/>
-            <w:tcBorders>
-              <w:top w:val="single" w:sz="1" w:space="0" w:color="BFBFBF"/>
-              <w:left w:val="single" w:sz="1" w:space="0" w:color="BFBFBF"/>
-              <w:bottom w:val="single" w:sz="1" w:space="0" w:color="BFBFBF"/>
-              <w:right w:val="single" w:sz="1" w:space="0" w:color="BFBFBF"/>
-            </w:tcBorders>
-            <w:shd w:val="clear" w:color="auto" w:fill="FFFFFF"/>
-            <w:tcMar>
-              <w:top w:w="60" w:type="dxa"/>
-              <w:left w:w="110" w:type="dxa"/>
-              <w:bottom w:w="60" w:type="dxa"/>
-              <w:right w:w="110" w:type="dxa"/>
-            </w:tcMar>
-          </w:tcPr>
-          <w:p>
-            <w:r>
-              <w:rPr>
-                <w:color w:val="000000"/>
-                <w:sz w:val="20"/>
-                <w:szCs w:val="20"/>
-              </w:rPr>
-              <w:t>disponible</w:t>
-            </w:r>
-          </w:p>
-        </w:tc>
-        <w:tc>
-          <w:tcPr>
-            <w:tcW w:w="1100" w:type="dxa"/>
-            <w:tcBorders>
-              <w:top w:val="single" w:sz="1" w:space="0" w:color="BFBFBF"/>
-              <w:left w:val="single" w:sz="1" w:space="0" w:color="BFBFBF"/>
-              <w:bottom w:val="single" w:sz="1" w:space="0" w:color="BFBFBF"/>
-              <w:right w:val="single" w:sz="1" w:space="0" w:color="BFBFBF"/>
-            </w:tcBorders>
-            <w:shd w:val="clear" w:color="auto" w:fill="FFFFFF"/>
-            <w:tcMar>
-              <w:top w:w="60" w:type="dxa"/>
-              <w:left w:w="110" w:type="dxa"/>
-              <w:bottom w:w="60" w:type="dxa"/>
-              <w:right w:w="110" w:type="dxa"/>
-            </w:tcMar>
-          </w:tcPr>
-          <w:p>
-            <w:r>
-              <w:rPr>
-                <w:color w:val="000000"/>
-                <w:sz w:val="20"/>
-                <w:szCs w:val="20"/>
-              </w:rPr>
-              <w:t>número</w:t>
-            </w:r>
-          </w:p>
-        </w:tc>
-        <w:tc>
-          <w:tcPr>
-            <w:tcW w:w="3026" w:type="dxa"/>
-            <w:tcBorders>
-              <w:top w:val="single" w:sz="1" w:space="0" w:color="BFBFBF"/>
-              <w:left w:val="single" w:sz="1" w:space="0" w:color="BFBFBF"/>
-              <w:bottom w:val="single" w:sz="1" w:space="0" w:color="BFBFBF"/>
-              <w:right w:val="single" w:sz="1" w:space="0" w:color="BFBFBF"/>
-            </w:tcBorders>
-            <w:shd w:val="clear" w:color="auto" w:fill="FFFFFF"/>
-            <w:tcMar>
-              <w:top w:w="60" w:type="dxa"/>
-              <w:left w:w="110" w:type="dxa"/>
-              <w:bottom w:w="60" w:type="dxa"/>
-              <w:right w:w="110" w:type="dxa"/>
-            </w:tcMar>
-          </w:tcPr>
-          <w:p>
-            <w:r>
-              <w:rPr>
-                <w:color w:val="000000"/>
-                <w:sz w:val="20"/>
-                <w:szCs w:val="20"/>
-              </w:rPr>
-              <w:t>Cantidad disponible de esa moneda</w:t>
-            </w:r>
-          </w:p>
-        </w:tc>
-        <w:tc>
-          <w:tcPr>
-            <w:tcW w:w="1700" w:type="dxa"/>
-            <w:tcBorders>
-              <w:top w:val="single" w:sz="1" w:space="0" w:color="BFBFBF"/>
-              <w:left w:val="single" w:sz="1" w:space="0" w:color="BFBFBF"/>
-              <w:bottom w:val="single" w:sz="1" w:space="0" w:color="BFBFBF"/>
-              <w:right w:val="single" w:sz="1" w:space="0" w:color="BFBFBF"/>
-            </w:tcBorders>
-            <w:shd w:val="clear" w:color="auto" w:fill="FFFFFF"/>
-            <w:tcMar>
-              <w:top w:w="60" w:type="dxa"/>
-              <w:left w:w="110" w:type="dxa"/>
-              <w:bottom w:w="60" w:type="dxa"/>
-              <w:right w:w="110" w:type="dxa"/>
-            </w:tcMar>
-          </w:tcPr>
-          <w:p>
-            <w:r>
-              <w:rPr>
-                <w:color w:val="000000"/>
-                <w:sz w:val="20"/>
-                <w:szCs w:val="20"/>
-              </w:rPr>
-              <w:t>mayor o igual a 0</w:t>
-            </w:r>
-          </w:p>
-        </w:tc>
-      </w:tr>
-      <w:tr>
-        <w:tblPrEx>
-          <w:tblCellMar>
-            <w:top w:w="0" w:type="dxa"/>
-            <w:bottom w:w="0" w:type="dxa"/>
-          </w:tblCellMar>
-        </w:tblPrEx>
-        <w:tc>
-          <w:tcPr>
-            <w:tcW w:w="1500" w:type="dxa"/>
-            <w:tcBorders>
-              <w:top w:val="single" w:sz="1" w:space="0" w:color="BFBFBF"/>
-              <w:left w:val="single" w:sz="1" w:space="0" w:color="BFBFBF"/>
-              <w:bottom w:val="single" w:sz="1" w:space="0" w:color="BFBFBF"/>
-              <w:right w:val="single" w:sz="1" w:space="0" w:color="BFBFBF"/>
-            </w:tcBorders>
-            <w:shd w:val="clear" w:color="auto" w:fill="FFFFFF"/>
-            <w:tcMar>
-              <w:top w:w="60" w:type="dxa"/>
-              <w:left w:w="110" w:type="dxa"/>
-              <w:bottom w:w="60" w:type="dxa"/>
-              <w:right w:w="110" w:type="dxa"/>
-            </w:tcMar>
-          </w:tcPr>
-          <w:p>
-            <w:r>
-              <w:rPr>
-                <w:color w:val="000000"/>
-                <w:sz w:val="20"/>
-                <w:szCs w:val="20"/>
-              </w:rPr>
-              <w:t>Operaciones</w:t>
-            </w:r>
-          </w:p>
-        </w:tc>
-        <w:tc>
-          <w:tcPr>
-            <w:tcW w:w="1700" w:type="dxa"/>
-            <w:tcBorders>
-              <w:top w:val="single" w:sz="1" w:space="0" w:color="BFBFBF"/>
-              <w:left w:val="single" w:sz="1" w:space="0" w:color="BFBFBF"/>
-              <w:bottom w:val="single" w:sz="1" w:space="0" w:color="BFBFBF"/>
-              <w:right w:val="single" w:sz="1" w:space="0" w:color="BFBFBF"/>
-            </w:tcBorders>
-            <w:shd w:val="clear" w:color="auto" w:fill="FFFFFF"/>
-            <w:tcMar>
-              <w:top w:w="60" w:type="dxa"/>
-              <w:left w:w="110" w:type="dxa"/>
-              <w:bottom w:w="60" w:type="dxa"/>
-              <w:right w:w="110" w:type="dxa"/>
-            </w:tcMar>
-          </w:tcPr>
-          <w:p>
-            <w:r>
-              <w:rPr>
-                <w:color w:val="000000"/>
-                <w:sz w:val="20"/>
-                <w:szCs w:val="20"/>
-              </w:rPr>
-              <w:t>tipo</w:t>
-            </w:r>
-          </w:p>
-        </w:tc>
-        <w:tc>
-          <w:tcPr>
-            <w:tcW w:w="1100" w:type="dxa"/>
-            <w:tcBorders>
-              <w:top w:val="single" w:sz="1" w:space="0" w:color="BFBFBF"/>
-              <w:left w:val="single" w:sz="1" w:space="0" w:color="BFBFBF"/>
-              <w:bottom w:val="single" w:sz="1" w:space="0" w:color="BFBFBF"/>
-              <w:right w:val="single" w:sz="1" w:space="0" w:color="BFBFBF"/>
-            </w:tcBorders>
-            <w:shd w:val="clear" w:color="auto" w:fill="FFFFFF"/>
-            <w:tcMar>
-              <w:top w:w="60" w:type="dxa"/>
-              <w:left w:w="110" w:type="dxa"/>
-              <w:bottom w:w="60" w:type="dxa"/>
-              <w:right w:w="110" w:type="dxa"/>
-            </w:tcMar>
-          </w:tcPr>
-          <w:p>
-            <w:r>
-              <w:rPr>
-                <w:color w:val="000000"/>
-                <w:sz w:val="20"/>
-                <w:szCs w:val="20"/>
-              </w:rPr>
-              <w:t>texto</w:t>
-            </w:r>
-          </w:p>
-        </w:tc>
-        <w:tc>
-          <w:tcPr>
-            <w:tcW w:w="3026" w:type="dxa"/>
-            <w:tcBorders>
-              <w:top w:val="single" w:sz="1" w:space="0" w:color="BFBFBF"/>
-              <w:left w:val="single" w:sz="1" w:space="0" w:color="BFBFBF"/>
-              <w:bottom w:val="single" w:sz="1" w:space="0" w:color="BFBFBF"/>
-              <w:right w:val="single" w:sz="1" w:space="0" w:color="BFBFBF"/>
-            </w:tcBorders>
-            <w:shd w:val="clear" w:color="auto" w:fill="FFFFFF"/>
-            <w:tcMar>
-              <w:top w:w="60" w:type="dxa"/>
-              <w:left w:w="110" w:type="dxa"/>
-              <w:bottom w:w="60" w:type="dxa"/>
-              <w:right w:w="110" w:type="dxa"/>
-            </w:tcMar>
-          </w:tcPr>
-          <w:p>
-            <w:r>
-              <w:rPr>
-                <w:color w:val="000000"/>
-                <w:sz w:val="20"/>
-                <w:szCs w:val="20"/>
-              </w:rPr>
-              <w:t>Operación desde el cliente</w:t>
-            </w:r>
-          </w:p>
-        </w:tc>
-        <w:tc>
-          <w:tcPr>
-            <w:tcW w:w="1700" w:type="dxa"/>
-            <w:tcBorders>
-              <w:top w:val="single" w:sz="1" w:space="0" w:color="BFBFBF"/>
-              <w:left w:val="single" w:sz="1" w:space="0" w:color="BFBFBF"/>
-              <w:bottom w:val="single" w:sz="1" w:space="0" w:color="BFBFBF"/>
-              <w:right w:val="single" w:sz="1" w:space="0" w:color="BFBFBF"/>
-            </w:tcBorders>
-            <w:shd w:val="clear" w:color="auto" w:fill="FFFFFF"/>
-            <w:tcMar>
-              <w:top w:w="60" w:type="dxa"/>
-              <w:left w:w="110" w:type="dxa"/>
-              <w:bottom w:w="60" w:type="dxa"/>
-              <w:right w:w="110" w:type="dxa"/>
-            </w:tcMar>
-          </w:tcPr>
-          <w:p>
-            <w:r>
-              <w:rPr>
-                <w:color w:val="000000"/>
-                <w:sz w:val="20"/>
-                <w:szCs w:val="20"/>
-              </w:rPr>
-              <w:t>compra / venta</w:t>
-            </w:r>
-          </w:p>
-        </w:tc>
-      </w:tr>
-      <w:tr>
-        <w:tblPrEx>
-          <w:tblCellMar>
-            <w:top w:w="0" w:type="dxa"/>
-            <w:bottom w:w="0" w:type="dxa"/>
-          </w:tblCellMar>
-        </w:tblPrEx>
-        <w:tc>
-          <w:tcPr>
-            <w:tcW w:w="1500" w:type="dxa"/>
-            <w:tcBorders>
-              <w:top w:val="single" w:sz="1" w:space="0" w:color="BFBFBF"/>
-              <w:left w:val="single" w:sz="1" w:space="0" w:color="BFBFBF"/>
-              <w:bottom w:val="single" w:sz="1" w:space="0" w:color="BFBFBF"/>
-              <w:right w:val="single" w:sz="1" w:space="0" w:color="BFBFBF"/>
-            </w:tcBorders>
-            <w:shd w:val="clear" w:color="auto" w:fill="FFFFFF"/>
-            <w:tcMar>
-              <w:top w:w="60" w:type="dxa"/>
-              <w:left w:w="110" w:type="dxa"/>
-              <w:bottom w:w="60" w:type="dxa"/>
-              <w:right w:w="110" w:type="dxa"/>
-            </w:tcMar>
-          </w:tcPr>
-          <w:p>
-            <w:r>
-              <w:rPr>
-                <w:color w:val="000000"/>
-                <w:sz w:val="20"/>
-                <w:szCs w:val="20"/>
-              </w:rPr>
-              <w:t>Operaciones</w:t>
-            </w:r>
-          </w:p>
-        </w:tc>
-        <w:tc>
-          <w:tcPr>
-            <w:tcW w:w="1700" w:type="dxa"/>
-            <w:tcBorders>
-              <w:top w:val="single" w:sz="1" w:space="0" w:color="BFBFBF"/>
-              <w:left w:val="single" w:sz="1" w:space="0" w:color="BFBFBF"/>
-              <w:bottom w:val="single" w:sz="1" w:space="0" w:color="BFBFBF"/>
-              <w:right w:val="single" w:sz="1" w:space="0" w:color="BFBFBF"/>
-            </w:tcBorders>
-            <w:shd w:val="clear" w:color="auto" w:fill="FFFFFF"/>
-            <w:tcMar>
-              <w:top w:w="60" w:type="dxa"/>
-              <w:left w:w="110" w:type="dxa"/>
-              <w:bottom w:w="60" w:type="dxa"/>
-              <w:right w:w="110" w:type="dxa"/>
-            </w:tcMar>
-          </w:tcPr>
-          <w:p>
-            <w:proofErr w:type="spellStart"/>
-            <w:r>
-              <w:rPr>
-                <w:color w:val="000000"/>
-                <w:sz w:val="20"/>
-                <w:szCs w:val="20"/>
-              </w:rPr>
-              <w:t>monto_divisa</w:t>
-            </w:r>
-            <w:proofErr w:type="spellEnd"/>
-          </w:p>
-        </w:tc>
-        <w:tc>
-          <w:tcPr>
-            <w:tcW w:w="1100" w:type="dxa"/>
-            <w:tcBorders>
-              <w:top w:val="single" w:sz="1" w:space="0" w:color="BFBFBF"/>
-              <w:left w:val="single" w:sz="1" w:space="0" w:color="BFBFBF"/>
-              <w:bottom w:val="single" w:sz="1" w:space="0" w:color="BFBFBF"/>
-              <w:right w:val="single" w:sz="1" w:space="0" w:color="BFBFBF"/>
-            </w:tcBorders>
-            <w:shd w:val="clear" w:color="auto" w:fill="FFFFFF"/>
-            <w:tcMar>
-              <w:top w:w="60" w:type="dxa"/>
-              <w:left w:w="110" w:type="dxa"/>
-              <w:bottom w:w="60" w:type="dxa"/>
-              <w:right w:w="110" w:type="dxa"/>
-            </w:tcMar>
-          </w:tcPr>
-          <w:p>
-            <w:r>
-              <w:rPr>
-                <w:color w:val="000000"/>
-                <w:sz w:val="20"/>
-                <w:szCs w:val="20"/>
-              </w:rPr>
-              <w:t>número</w:t>
-            </w:r>
-          </w:p>
-        </w:tc>
-        <w:tc>
-          <w:tcPr>
-            <w:tcW w:w="3026" w:type="dxa"/>
-            <w:tcBorders>
-              <w:top w:val="single" w:sz="1" w:space="0" w:color="BFBFBF"/>
-              <w:left w:val="single" w:sz="1" w:space="0" w:color="BFBFBF"/>
-              <w:bottom w:val="single" w:sz="1" w:space="0" w:color="BFBFBF"/>
-              <w:right w:val="single" w:sz="1" w:space="0" w:color="BFBFBF"/>
-            </w:tcBorders>
-            <w:shd w:val="clear" w:color="auto" w:fill="FFFFFF"/>
-            <w:tcMar>
-              <w:top w:w="60" w:type="dxa"/>
-              <w:left w:w="110" w:type="dxa"/>
-              <w:bottom w:w="60" w:type="dxa"/>
-              <w:right w:w="110" w:type="dxa"/>
-            </w:tcMar>
-          </w:tcPr>
-          <w:p>
-            <w:r>
-              <w:rPr>
-                <w:color w:val="000000"/>
-                <w:sz w:val="20"/>
-                <w:szCs w:val="20"/>
-              </w:rPr>
-              <w:t>Cantidad de divisa operada</w:t>
-            </w:r>
-          </w:p>
-        </w:tc>
-        <w:tc>
-          <w:tcPr>
-            <w:tcW w:w="1700" w:type="dxa"/>
-            <w:tcBorders>
-              <w:top w:val="single" w:sz="1" w:space="0" w:color="BFBFBF"/>
-              <w:left w:val="single" w:sz="1" w:space="0" w:color="BFBFBF"/>
-              <w:bottom w:val="single" w:sz="1" w:space="0" w:color="BFBFBF"/>
-              <w:right w:val="single" w:sz="1" w:space="0" w:color="BFBFBF"/>
-            </w:tcBorders>
-            <w:shd w:val="clear" w:color="auto" w:fill="FFFFFF"/>
-            <w:tcMar>
-              <w:top w:w="60" w:type="dxa"/>
-              <w:left w:w="110" w:type="dxa"/>
-              <w:bottom w:w="60" w:type="dxa"/>
-              <w:right w:w="110" w:type="dxa"/>
-            </w:tcMar>
-          </w:tcPr>
-          <w:p>
-            <w:r>
-              <w:rPr>
-                <w:color w:val="000000"/>
-                <w:sz w:val="20"/>
-                <w:szCs w:val="20"/>
-              </w:rPr>
-              <w:t>&gt; 0</w:t>
-            </w:r>
-          </w:p>
-        </w:tc>
-      </w:tr>
-      <w:tr>
-        <w:tblPrEx>
-          <w:tblCellMar>
-            <w:top w:w="0" w:type="dxa"/>
-            <w:bottom w:w="0" w:type="dxa"/>
-          </w:tblCellMar>
-        </w:tblPrEx>
-        <w:tc>
-          <w:tcPr>
-            <w:tcW w:w="1500" w:type="dxa"/>
-            <w:tcBorders>
-              <w:top w:val="single" w:sz="1" w:space="0" w:color="BFBFBF"/>
-              <w:left w:val="single" w:sz="1" w:space="0" w:color="BFBFBF"/>
-              <w:bottom w:val="single" w:sz="1" w:space="0" w:color="BFBFBF"/>
-              <w:right w:val="single" w:sz="1" w:space="0" w:color="BFBFBF"/>
-            </w:tcBorders>
-            <w:shd w:val="clear" w:color="auto" w:fill="FFFFFF"/>
-            <w:tcMar>
-              <w:top w:w="60" w:type="dxa"/>
-              <w:left w:w="110" w:type="dxa"/>
-              <w:bottom w:w="60" w:type="dxa"/>
-              <w:right w:w="110" w:type="dxa"/>
-            </w:tcMar>
-          </w:tcPr>
-          <w:p>
-            <w:r>
-              <w:rPr>
-                <w:color w:val="000000"/>
-                <w:sz w:val="20"/>
-                <w:szCs w:val="20"/>
-              </w:rPr>
-              <w:t>Operaciones</w:t>
-            </w:r>
-          </w:p>
-        </w:tc>
-        <w:tc>
-          <w:tcPr>
-            <w:tcW w:w="1700" w:type="dxa"/>
-            <w:tcBorders>
-              <w:top w:val="single" w:sz="1" w:space="0" w:color="BFBFBF"/>
-              <w:left w:val="single" w:sz="1" w:space="0" w:color="BFBFBF"/>
-              <w:bottom w:val="single" w:sz="1" w:space="0" w:color="BFBFBF"/>
-              <w:right w:val="single" w:sz="1" w:space="0" w:color="BFBFBF"/>
-            </w:tcBorders>
-            <w:shd w:val="clear" w:color="auto" w:fill="FFFFFF"/>
-            <w:tcMar>
-              <w:top w:w="60" w:type="dxa"/>
-              <w:left w:w="110" w:type="dxa"/>
-              <w:bottom w:w="60" w:type="dxa"/>
-              <w:right w:w="110" w:type="dxa"/>
-            </w:tcMar>
-          </w:tcPr>
-          <w:p>
-            <w:proofErr w:type="spellStart"/>
-            <w:r>
-              <w:rPr>
-                <w:color w:val="000000"/>
-                <w:sz w:val="20"/>
-                <w:szCs w:val="20"/>
-              </w:rPr>
-              <w:t>total_ars</w:t>
-            </w:r>
-            <w:proofErr w:type="spellEnd"/>
-          </w:p>
-        </w:tc>
-        <w:tc>
-          <w:tcPr>
-            <w:tcW w:w="1100" w:type="dxa"/>
-            <w:tcBorders>
-              <w:top w:val="single" w:sz="1" w:space="0" w:color="BFBFBF"/>
-              <w:left w:val="single" w:sz="1" w:space="0" w:color="BFBFBF"/>
-              <w:bottom w:val="single" w:sz="1" w:space="0" w:color="BFBFBF"/>
-              <w:right w:val="single" w:sz="1" w:space="0" w:color="BFBFBF"/>
-            </w:tcBorders>
-            <w:shd w:val="clear" w:color="auto" w:fill="FFFFFF"/>
-            <w:tcMar>
-              <w:top w:w="60" w:type="dxa"/>
-              <w:left w:w="110" w:type="dxa"/>
-              <w:bottom w:w="60" w:type="dxa"/>
-              <w:right w:w="110" w:type="dxa"/>
-            </w:tcMar>
-          </w:tcPr>
-          <w:p>
-            <w:r>
-              <w:rPr>
-                <w:color w:val="000000"/>
-                <w:sz w:val="20"/>
-                <w:szCs w:val="20"/>
-              </w:rPr>
-              <w:t>número</w:t>
-            </w:r>
-          </w:p>
-        </w:tc>
-        <w:tc>
-          <w:tcPr>
-            <w:tcW w:w="3026" w:type="dxa"/>
-            <w:tcBorders>
-              <w:top w:val="single" w:sz="1" w:space="0" w:color="BFBFBF"/>
-              <w:left w:val="single" w:sz="1" w:space="0" w:color="BFBFBF"/>
-              <w:bottom w:val="single" w:sz="1" w:space="0" w:color="BFBFBF"/>
-              <w:right w:val="single" w:sz="1" w:space="0" w:color="BFBFBF"/>
-            </w:tcBorders>
-            <w:shd w:val="clear" w:color="auto" w:fill="FFFFFF"/>
-            <w:tcMar>
-              <w:top w:w="60" w:type="dxa"/>
-              <w:left w:w="110" w:type="dxa"/>
-              <w:bottom w:w="60" w:type="dxa"/>
-              <w:right w:w="110" w:type="dxa"/>
-            </w:tcMar>
-          </w:tcPr>
-          <w:p>
-            <w:proofErr w:type="spellStart"/>
-            <w:r>
-              <w:rPr>
-                <w:color w:val="000000"/>
-                <w:sz w:val="20"/>
-                <w:szCs w:val="20"/>
-              </w:rPr>
-              <w:t>monto_divisa</w:t>
-            </w:r>
-            <w:proofErr w:type="spellEnd"/>
-            <w:r>
-              <w:rPr>
-                <w:color w:val="000000"/>
-                <w:sz w:val="20"/>
-                <w:szCs w:val="20"/>
-              </w:rPr>
-              <w:t xml:space="preserve"> por cotización aplicada</w:t>
-            </w:r>
-          </w:p>
-        </w:tc>
-        <w:tc>
-          <w:tcPr>
-            <w:tcW w:w="1700" w:type="dxa"/>
-            <w:tcBorders>
-              <w:top w:val="single" w:sz="1" w:space="0" w:color="BFBFBF"/>
-              <w:left w:val="single" w:sz="1" w:space="0" w:color="BFBFBF"/>
-              <w:bottom w:val="single" w:sz="1" w:space="0" w:color="BFBFBF"/>
-              <w:right w:val="single" w:sz="1" w:space="0" w:color="BFBFBF"/>
-            </w:tcBorders>
-            <w:shd w:val="clear" w:color="auto" w:fill="FFFFFF"/>
-            <w:tcMar>
-              <w:top w:w="60" w:type="dxa"/>
-              <w:left w:w="110" w:type="dxa"/>
-              <w:bottom w:w="60" w:type="dxa"/>
-              <w:right w:w="110" w:type="dxa"/>
-            </w:tcMar>
-          </w:tcPr>
-          <w:p>
-            <w:r>
-              <w:rPr>
-                <w:color w:val="000000"/>
-                <w:sz w:val="20"/>
-                <w:szCs w:val="20"/>
-              </w:rPr>
-              <w:t>calculado</w:t>
-            </w:r>
-          </w:p>
-        </w:tc>
-      </w:tr>
-      <w:tr>
-        <w:tblPrEx>
-          <w:tblCellMar>
-            <w:top w:w="0" w:type="dxa"/>
-            <w:bottom w:w="0" w:type="dxa"/>
-          </w:tblCellMar>
-        </w:tblPrEx>
-        <w:tc>
-          <w:tcPr>
-            <w:tcW w:w="1500" w:type="dxa"/>
-            <w:tcBorders>
-              <w:top w:val="single" w:sz="1" w:space="0" w:color="BFBFBF"/>
-              <w:left w:val="single" w:sz="1" w:space="0" w:color="BFBFBF"/>
-              <w:bottom w:val="single" w:sz="1" w:space="0" w:color="BFBFBF"/>
-              <w:right w:val="single" w:sz="1" w:space="0" w:color="BFBFBF"/>
-            </w:tcBorders>
-            <w:shd w:val="clear" w:color="auto" w:fill="FFFFFF"/>
-            <w:tcMar>
-              <w:top w:w="60" w:type="dxa"/>
-              <w:left w:w="110" w:type="dxa"/>
-              <w:bottom w:w="60" w:type="dxa"/>
-              <w:right w:w="110" w:type="dxa"/>
-            </w:tcMar>
-          </w:tcPr>
-          <w:p>
-            <w:r>
-              <w:rPr>
-                <w:color w:val="000000"/>
-                <w:sz w:val="20"/>
-                <w:szCs w:val="20"/>
-              </w:rPr>
-              <w:t>Operaciones</w:t>
-            </w:r>
-          </w:p>
-        </w:tc>
-        <w:tc>
-          <w:tcPr>
-            <w:tcW w:w="1700" w:type="dxa"/>
-            <w:tcBorders>
-              <w:top w:val="single" w:sz="1" w:space="0" w:color="BFBFBF"/>
-              <w:left w:val="single" w:sz="1" w:space="0" w:color="BFBFBF"/>
-              <w:bottom w:val="single" w:sz="1" w:space="0" w:color="BFBFBF"/>
-              <w:right w:val="single" w:sz="1" w:space="0" w:color="BFBFBF"/>
-            </w:tcBorders>
-            <w:shd w:val="clear" w:color="auto" w:fill="FFFFFF"/>
-            <w:tcMar>
-              <w:top w:w="60" w:type="dxa"/>
-              <w:left w:w="110" w:type="dxa"/>
-              <w:bottom w:w="60" w:type="dxa"/>
-              <w:right w:w="110" w:type="dxa"/>
-            </w:tcMar>
-          </w:tcPr>
-          <w:p>
-            <w:r>
-              <w:rPr>
-                <w:color w:val="000000"/>
-                <w:sz w:val="20"/>
-                <w:szCs w:val="20"/>
-              </w:rPr>
-              <w:t>estado</w:t>
-            </w:r>
-          </w:p>
-        </w:tc>
-        <w:tc>
-          <w:tcPr>
-            <w:tcW w:w="1100" w:type="dxa"/>
-            <w:tcBorders>
-              <w:top w:val="single" w:sz="1" w:space="0" w:color="BFBFBF"/>
-              <w:left w:val="single" w:sz="1" w:space="0" w:color="BFBFBF"/>
-              <w:bottom w:val="single" w:sz="1" w:space="0" w:color="BFBFBF"/>
-              <w:right w:val="single" w:sz="1" w:space="0" w:color="BFBFBF"/>
-            </w:tcBorders>
-            <w:shd w:val="clear" w:color="auto" w:fill="FFFFFF"/>
-            <w:tcMar>
-              <w:top w:w="60" w:type="dxa"/>
-              <w:left w:w="110" w:type="dxa"/>
-              <w:bottom w:w="60" w:type="dxa"/>
-              <w:right w:w="110" w:type="dxa"/>
-            </w:tcMar>
-          </w:tcPr>
-          <w:p>
-            <w:r>
-              <w:rPr>
-                <w:color w:val="000000"/>
-                <w:sz w:val="20"/>
-                <w:szCs w:val="20"/>
-              </w:rPr>
-              <w:t>texto</w:t>
-            </w:r>
-          </w:p>
-        </w:tc>
-        <w:tc>
-          <w:tcPr>
-            <w:tcW w:w="3026" w:type="dxa"/>
-            <w:tcBorders>
-              <w:top w:val="single" w:sz="1" w:space="0" w:color="BFBFBF"/>
-              <w:left w:val="single" w:sz="1" w:space="0" w:color="BFBFBF"/>
-              <w:bottom w:val="single" w:sz="1" w:space="0" w:color="BFBFBF"/>
-              <w:right w:val="single" w:sz="1" w:space="0" w:color="BFBFBF"/>
-            </w:tcBorders>
-            <w:shd w:val="clear" w:color="auto" w:fill="FFFFFF"/>
-            <w:tcMar>
-              <w:top w:w="60" w:type="dxa"/>
-              <w:left w:w="110" w:type="dxa"/>
-              <w:bottom w:w="60" w:type="dxa"/>
-              <w:right w:w="110" w:type="dxa"/>
-            </w:tcMar>
-          </w:tcPr>
-          <w:p>
-            <w:r>
-              <w:rPr>
-                <w:color w:val="000000"/>
-                <w:sz w:val="20"/>
-                <w:szCs w:val="20"/>
-              </w:rPr>
-              <w:t>Resultado de la operación</w:t>
-            </w:r>
-          </w:p>
-        </w:tc>
-        <w:tc>
-          <w:tcPr>
-            <w:tcW w:w="1700" w:type="dxa"/>
-            <w:tcBorders>
-              <w:top w:val="single" w:sz="1" w:space="0" w:color="BFBFBF"/>
-              <w:left w:val="single" w:sz="1" w:space="0" w:color="BFBFBF"/>
-              <w:bottom w:val="single" w:sz="1" w:space="0" w:color="BFBFBF"/>
-              <w:right w:val="single" w:sz="1" w:space="0" w:color="BFBFBF"/>
-            </w:tcBorders>
-            <w:shd w:val="clear" w:color="auto" w:fill="FFFFFF"/>
-            <w:tcMar>
-              <w:top w:w="60" w:type="dxa"/>
-              <w:left w:w="110" w:type="dxa"/>
-              <w:bottom w:w="60" w:type="dxa"/>
-              <w:right w:w="110" w:type="dxa"/>
-            </w:tcMar>
-          </w:tcPr>
-          <w:p>
-            <w:r>
-              <w:rPr>
-                <w:color w:val="000000"/>
-                <w:sz w:val="20"/>
-                <w:szCs w:val="20"/>
-              </w:rPr>
-              <w:t>COMPLETADA / CANCELADA / RECHAZADA</w:t>
-            </w:r>
-          </w:p>
-        </w:tc>
-      </w:tr>
-    </w:tbl>
+    <w:p>
+      <w:pPr>
+        <w:spacing w:after="120" w:line="276" w:lineRule="auto"/>
+        <w:jc w:val="both"/>
+      </w:pPr>
+      <w:r>
+        <w:drawing>
+          <wp:inline distT="0" distB="0" distL="0" distR="0" wp14:anchorId="23838068" wp14:editId="0F5DA8FD">
+            <wp:extent cx="6515994" cy="2533650"/>
+            <wp:effectExtent l="0" t="0" r="0" b="0"/>
+            <wp:docPr id="113820462" name="Imagen 1"/>
+            <wp:cNvGraphicFramePr>
+              <a:graphicFrameLocks xmlns:a="http://schemas.openxmlformats.org/drawingml/2006/main" noChangeAspect="1"/>
+            </wp:cNvGraphicFramePr>
+            <a:graphic xmlns:a="http://schemas.openxmlformats.org/drawingml/2006/main">
+              <a:graphicData uri="http://schemas.openxmlformats.org/drawingml/2006/picture">
+                <pic:pic xmlns:pic="http://schemas.openxmlformats.org/drawingml/2006/picture">
+                  <pic:nvPicPr>
+                    <pic:cNvPr id="0" name="Picture 1"/>
+                    <pic:cNvPicPr>
+                      <a:picLocks noChangeAspect="1" noChangeArrowheads="1"/>
+                    </pic:cNvPicPr>
+                  </pic:nvPicPr>
+                  <pic:blipFill>
+                    <a:blip r:embed="rId8">
+                      <a:extLst>
+                        <a:ext uri="{28A0092B-C50C-407E-A947-70E740481C1C}">
+                          <a14:useLocalDpi xmlns:a14="http://schemas.microsoft.com/office/drawing/2010/main" val="0"/>
+                        </a:ext>
+                      </a:extLst>
+                    </a:blip>
+                    <a:srcRect/>
+                    <a:stretch>
+                      <a:fillRect/>
+                    </a:stretch>
+                  </pic:blipFill>
+                  <pic:spPr bwMode="auto">
+                    <a:xfrm>
+                      <a:off x="0" y="0"/>
+                      <a:ext cx="6552224" cy="2547738"/>
+                    </a:xfrm>
+                    <a:prstGeom prst="rect">
+                      <a:avLst/>
+                    </a:prstGeom>
+                    <a:noFill/>
+                    <a:ln>
+                      <a:noFill/>
+                    </a:ln>
+                  </pic:spPr>
+                </pic:pic>
+              </a:graphicData>
+            </a:graphic>
+          </wp:inline>
+        </w:drawing>
+      </w:r>
+    </w:p>
+    <w:p>
+      <w:pPr>
+        <w:spacing w:before="240" w:after="120"/>
+        <w:rPr>
+          <w:b/>
+          <w:bCs/>
+          <w:sz w:val="24"/>
+          <w:szCs w:val="24"/>
+        </w:rPr>
+      </w:pPr>
+    </w:p>
+    <w:p>
+      <w:pPr>
+        <w:spacing w:before="240" w:after="120"/>
+        <w:rPr>
+          <w:b/>
+          <w:bCs/>
+          <w:sz w:val="24"/>
+          <w:szCs w:val="24"/>
+        </w:rPr>
+      </w:pPr>
+    </w:p>
+    <w:p>
+      <w:pPr>
+        <w:spacing w:before="240" w:after="120"/>
+        <w:rPr>
+          <w:b/>
+          <w:bCs/>
+          <w:sz w:val="24"/>
+          <w:szCs w:val="24"/>
+        </w:rPr>
+      </w:pPr>
+    </w:p>
+    <w:p>
+      <w:pPr>
+        <w:spacing w:before="240" w:after="120"/>
+        <w:rPr>
+          <w:b/>
+          <w:bCs/>
+          <w:sz w:val="24"/>
+          <w:szCs w:val="24"/>
+        </w:rPr>
+      </w:pPr>
+      <w:r>
+        <w:rPr>
+          <w:b/>
+          <w:bCs/>
+          <w:noProof/>
+          <w:sz w:val="24"/>
+          <w:szCs w:val="24"/>
+        </w:rPr>
+        <w:lastRenderedPageBreak/>
+        <w:drawing>
+          <wp:inline distT="0" distB="0" distL="0" distR="0" wp14:anchorId="1E9C36BA" wp14:editId="1CB690F2">
+            <wp:extent cx="8552728" cy="5901440"/>
+            <wp:effectExtent l="0" t="0" r="1270" b="4445"/>
+            <wp:docPr id="1277145717" name="Gráfico 2"/>
+            <wp:cNvGraphicFramePr>
+              <a:graphicFrameLocks xmlns:a="http://schemas.openxmlformats.org/drawingml/2006/main" noChangeAspect="1"/>
+            </wp:cNvGraphicFramePr>
+            <a:graphic xmlns:a="http://schemas.openxmlformats.org/drawingml/2006/main">
+              <a:graphicData uri="http://schemas.openxmlformats.org/drawingml/2006/picture">
+                <pic:pic xmlns:pic="http://schemas.openxmlformats.org/drawingml/2006/picture">
+                  <pic:nvPicPr>
+                    <pic:cNvPr id="1277145717" name="Gráfico 1277145717"/>
+                    <pic:cNvPicPr/>
+                  </pic:nvPicPr>
+                  <pic:blipFill>
+                    <a:blip r:embed="rId9">
+                      <a:extLst>
+                        <a:ext uri="{96DAC541-7B7A-43D3-8B79-37D633B846F1}">
+                          <asvg:svgBlip xmlns:asvg="http://schemas.microsoft.com/office/drawing/2016/SVG/main" r:embed="rId10"/>
+                        </a:ext>
+                      </a:extLst>
+                    </a:blip>
+                    <a:stretch>
+                      <a:fillRect/>
+                    </a:stretch>
+                  </pic:blipFill>
+                  <pic:spPr>
+                    <a:xfrm>
+                      <a:off x="0" y="0"/>
+                      <a:ext cx="8590411" cy="5927442"/>
+                    </a:xfrm>
+                    <a:prstGeom prst="rect">
+                      <a:avLst/>
+                    </a:prstGeom>
+                  </pic:spPr>
+                </pic:pic>
+              </a:graphicData>
+            </a:graphic>
+          </wp:inline>
+        </w:drawing>
+      </w:r>
+    </w:p>
+    <w:p>
+      <w:pPr>
+        <w:spacing w:before="240" w:after="120"/>
+        <w:rPr>
+          <w:b/>
+          <w:bCs/>
+          <w:sz w:val="24"/>
+          <w:szCs w:val="24"/>
+        </w:rPr>
+      </w:pPr>
+    </w:p>
     <w:p>
       <w:pPr>
         <w:spacing w:before="240" w:after="120"/>
@@ -3570,12 +2182,6 @@
         <w:gridCol w:w="2054"/>
       </w:tblGrid>
       <w:tr>
-        <w:tblPrEx>
-          <w:tblCellMar>
-            <w:top w:w="0" w:type="dxa"/>
-            <w:bottom w:w="0" w:type="dxa"/>
-          </w:tblCellMar>
-        </w:tblPrEx>
         <w:trPr>
           <w:tblHeader/>
         </w:trPr>
@@ -3605,7 +2211,6 @@
                 <w:sz w:val="20"/>
                 <w:szCs w:val="20"/>
               </w:rPr>
-              <w:lastRenderedPageBreak/>
               <w:t>Estado</w:t>
             </w:r>
           </w:p>
@@ -3714,12 +2319,6 @@
         </w:tc>
       </w:tr>
       <w:tr>
-        <w:tblPrEx>
-          <w:tblCellMar>
-            <w:top w:w="0" w:type="dxa"/>
-            <w:bottom w:w="0" w:type="dxa"/>
-          </w:tblCellMar>
-        </w:tblPrEx>
         <w:tc>
           <w:tcPr>
             <w:tcW w:w="1900" w:type="dxa"/>
@@ -3834,12 +2433,6 @@
         </w:tc>
       </w:tr>
       <w:tr>
-        <w:tblPrEx>
-          <w:tblCellMar>
-            <w:top w:w="0" w:type="dxa"/>
-            <w:bottom w:w="0" w:type="dxa"/>
-          </w:tblCellMar>
-        </w:tblPrEx>
         <w:tc>
           <w:tcPr>
             <w:tcW w:w="1900" w:type="dxa"/>
@@ -3990,12 +2583,6 @@
         </w:tc>
       </w:tr>
       <w:tr>
-        <w:tblPrEx>
-          <w:tblCellMar>
-            <w:top w:w="0" w:type="dxa"/>
-            <w:bottom w:w="0" w:type="dxa"/>
-          </w:tblCellMar>
-        </w:tblPrEx>
         <w:tc>
           <w:tcPr>
             <w:tcW w:w="1900" w:type="dxa"/>
@@ -4110,12 +2697,6 @@
         </w:tc>
       </w:tr>
       <w:tr>
-        <w:tblPrEx>
-          <w:tblCellMar>
-            <w:top w:w="0" w:type="dxa"/>
-            <w:bottom w:w="0" w:type="dxa"/>
-          </w:tblCellMar>
-        </w:tblPrEx>
         <w:tc>
           <w:tcPr>
             <w:tcW w:w="1900" w:type="dxa"/>
@@ -4140,6 +2721,7 @@
                 <w:sz w:val="20"/>
                 <w:szCs w:val="20"/>
               </w:rPr>
+              <w:lastRenderedPageBreak/>
               <w:t>ESPERA_MONTO</w:t>
             </w:r>
           </w:p>
@@ -4230,12 +2812,6 @@
         </w:tc>
       </w:tr>
       <w:tr>
-        <w:tblPrEx>
-          <w:tblCellMar>
-            <w:top w:w="0" w:type="dxa"/>
-            <w:bottom w:w="0" w:type="dxa"/>
-          </w:tblCellMar>
-        </w:tblPrEx>
         <w:tc>
           <w:tcPr>
             <w:tcW w:w="1900" w:type="dxa"/>
@@ -4491,8 +3067,20 @@
           <w:sz w:val="20"/>
           <w:szCs w:val="20"/>
         </w:rPr>
-        <w:t>[ Insertar capturas de pantalla de las consultas y respuestas de IA ]</w:t>
-      </w:r>
+        <w:t xml:space="preserve">[ Insertar capturas de pantalla de las consultas y respuestas de </w:t>
+      </w:r>
+      <w:proofErr w:type="gramStart"/>
+      <w:r>
+        <w:rPr>
+          <w:i/>
+          <w:iCs/>
+          <w:color w:val="777777"/>
+          <w:sz w:val="20"/>
+          <w:szCs w:val="20"/>
+        </w:rPr>
+        <w:t>IA ]</w:t>
+      </w:r>
+      <w:proofErr w:type="gramEnd"/>
     </w:p>
     <w:p>
       <w:pPr>
@@ -4550,10 +3138,7 @@
         <w:spacing w:after="60" w:line="276" w:lineRule="auto"/>
       </w:pPr>
       <w:r>
-        <w:t>operar</w:t>
-      </w:r>
-      <w:r>
-        <w:t>: inicia la conversación y muestra las monedas disponibles.</w:t>
+        <w:t>operar: inicia la conversación y muestra las monedas disponibles.</w:t>
       </w:r>
     </w:p>
     <w:p>
@@ -4652,11 +3237,7 @@
         <w:jc w:val="both"/>
       </w:pPr>
       <w:r>
-        <w:t xml:space="preserve">El trabajo integró la perspectiva de negocio con la implementación técnica: a partir del modelado BPMN 2.0 del proceso actual y propuesto, se derivó una máquina de estados coherente con el diagrama, se </w:t>
-      </w:r>
-      <w:r>
-        <w:lastRenderedPageBreak/>
-        <w:t xml:space="preserve">diseñó una base de datos simulada y se contemplaron los flujos de excepción. El diagrama BPMN actuó como contrato del software, garantizando que cada decisión del diseño se traduzca en una estructura lógica del </w:t>
+        <w:t xml:space="preserve">El trabajo integró la perspectiva de negocio con la implementación técnica: a partir del modelado BPMN 2.0 del proceso actual y propuesto, se derivó una máquina de estados coherente con el diagrama, se diseñó una base de datos simulada y se contemplaron los flujos de excepción. El diagrama BPMN actuó como contrato del software, garantizando que cada decisión del diseño se traduzca en una estructura lógica del </w:t>
       </w:r>
       <w:proofErr w:type="spellStart"/>
       <w:r>
@@ -4670,14 +3251,26 @@
     <w:p>
       <w:pPr>
         <w:spacing w:before="240" w:after="120"/>
-      </w:pPr>
-      <w:r>
         <w:rPr>
           <w:b/>
           <w:bCs/>
           <w:sz w:val="24"/>
           <w:szCs w:val="24"/>
         </w:rPr>
+      </w:pPr>
+    </w:p>
+    <w:p>
+      <w:pPr>
+        <w:spacing w:before="240" w:after="120"/>
+      </w:pPr>
+      <w:r>
+        <w:rPr>
+          <w:b/>
+          <w:bCs/>
+          <w:sz w:val="24"/>
+          <w:szCs w:val="24"/>
+        </w:rPr>
+        <w:lastRenderedPageBreak/>
         <w:t>11. REPOSITORIO DE CÓDIGO</w:t>
       </w:r>
     </w:p>
@@ -4701,8 +3294,18 @@
           <w:iCs/>
           <w:color w:val="777777"/>
         </w:rPr>
-        <w:t>[ Insertar enlace al repositorio de GitHub ]</w:t>
-      </w:r>
+        <w:t xml:space="preserve">[ Insertar enlace al repositorio de </w:t>
+      </w:r>
+      <w:proofErr w:type="gramStart"/>
+      <w:r>
+        <w:rPr>
+          <w:i/>
+          <w:iCs/>
+          <w:color w:val="777777"/>
+        </w:rPr>
+        <w:t>GitHub ]</w:t>
+      </w:r>
+      <w:proofErr w:type="gramEnd"/>
     </w:p>
     <w:sectPr>
       <w:pgSz w:w="11906" w:h="16838"/>
@@ -5353,6 +3956,7 @@
   <w:style w:type="character" w:default="1" w:styleId="Fuentedeprrafopredeter">
     <w:name w:val="Default Paragraph Font"/>
     <w:uiPriority w:val="1"/>
+    <w:semiHidden/>
     <w:unhideWhenUsed/>
   </w:style>
   <w:style w:type="table" w:default="1" w:styleId="Tablanormal">

</xml_diff>